<commit_message>
A lot of work done today,  worked though lab 3 and finishing up onb lab 4, took out hard coded table data and replaced it with data in the flight.js file. Also created a .env file which keeps password safe from being exposed on GitHub.
</commit_message>
<xml_diff>
--- a/Report.docx
+++ b/Report.docx
@@ -95,7 +95,21 @@
         <w:rPr>
           <w:lang w:val="en-IE"/>
         </w:rPr>
-        <w:t>Following the first lab sheet doing initial commits renaming variables and changing the code so that I suits my Skyboard project.</w:t>
+        <w:t xml:space="preserve">Following the first lab sheet doing initial commits renaming variables and changing the code so that I </w:t>
+      </w:r>
+      <w:proofErr w:type="gramStart"/>
+      <w:r>
+        <w:rPr>
+          <w:lang w:val="en-IE"/>
+        </w:rPr>
+        <w:t>suits</w:t>
+      </w:r>
+      <w:proofErr w:type="gramEnd"/>
+      <w:r>
+        <w:rPr>
+          <w:lang w:val="en-IE"/>
+        </w:rPr>
+        <w:t xml:space="preserve"> my Skyboard project.</w:t>
       </w:r>
     </w:p>
     <w:p>
@@ -153,12 +167,14 @@
         </w:rPr>
         <w:t xml:space="preserve">Set up the Git, added </w:t>
       </w:r>
+      <w:proofErr w:type="gramStart"/>
       <w:r>
         <w:rPr>
           <w:lang w:val="en-IE"/>
         </w:rPr>
         <w:t>a .gitignore</w:t>
       </w:r>
+      <w:proofErr w:type="gramEnd"/>
       <w:r>
         <w:rPr>
           <w:lang w:val="en-IE"/>
@@ -187,7 +203,35 @@
         <w:rPr>
           <w:lang w:val="en-IE"/>
         </w:rPr>
-        <w:t>A problem I had was committing all the node_modules but I used a .gitignore and git rm -r –cached node_modules to fix it.</w:t>
+        <w:t>A problem I had was committing all the node_</w:t>
+      </w:r>
+      <w:proofErr w:type="gramStart"/>
+      <w:r>
+        <w:rPr>
+          <w:lang w:val="en-IE"/>
+        </w:rPr>
+        <w:t>modules</w:t>
+      </w:r>
+      <w:proofErr w:type="gramEnd"/>
+      <w:r>
+        <w:rPr>
+          <w:lang w:val="en-IE"/>
+        </w:rPr>
+        <w:t xml:space="preserve"> but I used </w:t>
+      </w:r>
+      <w:proofErr w:type="gramStart"/>
+      <w:r>
+        <w:rPr>
+          <w:lang w:val="en-IE"/>
+        </w:rPr>
+        <w:t>a .gitignore</w:t>
+      </w:r>
+      <w:proofErr w:type="gramEnd"/>
+      <w:r>
+        <w:rPr>
+          <w:lang w:val="en-IE"/>
+        </w:rPr>
+        <w:t xml:space="preserve"> and git rm -r –cached node_modules to fix it.</w:t>
       </w:r>
     </w:p>
     <w:p>
@@ -381,6 +425,24 @@
         <w:pStyle w:val="ListParagraph"/>
         <w:numPr>
           <w:ilvl w:val="0"/>
+          <w:numId w:val="4"/>
+        </w:numPr>
+        <w:rPr>
+          <w:lang w:val="en-IE"/>
+        </w:rPr>
+      </w:pPr>
+      <w:r>
+        <w:rPr>
+          <w:lang w:val="en-IE"/>
+        </w:rPr>
+        <w:t xml:space="preserve">Claude was also used for ideas and debugging </w:t>
+      </w:r>
+    </w:p>
+    <w:p>
+      <w:pPr>
+        <w:pStyle w:val="ListParagraph"/>
+        <w:numPr>
+          <w:ilvl w:val="0"/>
           <w:numId w:val="3"/>
         </w:numPr>
         <w:rPr>
@@ -573,6 +635,54 @@
             <w:rStyle w:val="Hyperlink"/>
           </w:rPr>
           <w:t>Color modes · Bootstrap v5.3</w:t>
+        </w:r>
+      </w:hyperlink>
+    </w:p>
+    <w:p>
+      <w:pPr>
+        <w:pStyle w:val="ListParagraph"/>
+        <w:numPr>
+          <w:ilvl w:val="0"/>
+          <w:numId w:val="3"/>
+        </w:numPr>
+        <w:rPr>
+          <w:lang w:val="en-IE"/>
+        </w:rPr>
+      </w:pPr>
+      <w:hyperlink r:id="rId17" w:history="1">
+        <w:r>
+          <w:rPr>
+            <w:rStyle w:val="Hyperlink"/>
+          </w:rPr>
+          <w:t>Template Inheritance – Pug</w:t>
+        </w:r>
+      </w:hyperlink>
+    </w:p>
+    <w:p>
+      <w:pPr>
+        <w:pStyle w:val="ListParagraph"/>
+        <w:numPr>
+          <w:ilvl w:val="0"/>
+          <w:numId w:val="3"/>
+        </w:numPr>
+        <w:rPr>
+          <w:lang w:val="en-IE"/>
+        </w:rPr>
+      </w:pPr>
+      <w:hyperlink r:id="rId18" w:history="1">
+        <w:proofErr w:type="spellStart"/>
+        <w:r>
+          <w:rPr>
+            <w:rStyle w:val="Hyperlink"/>
+          </w:rPr>
+          <w:t>PugHTML</w:t>
+        </w:r>
+        <w:proofErr w:type="spellEnd"/>
+        <w:r>
+          <w:rPr>
+            <w:rStyle w:val="Hyperlink"/>
+          </w:rPr>
+          <w:t xml:space="preserve"> - HTML to Pug/Jade Converter with Bootstrap &amp; Tailwind CSS</w:t>
         </w:r>
       </w:hyperlink>
     </w:p>
@@ -702,6 +812,119 @@
     </w:lvl>
   </w:abstractNum>
   <w:abstractNum w:abstractNumId="1" w15:restartNumberingAfterBreak="0">
+    <w:nsid w:val="2EAB07E3"/>
+    <w:multiLevelType w:val="hybridMultilevel"/>
+    <w:tmpl w:val="8BBE8212"/>
+    <w:lvl w:ilvl="0" w:tplc="04090001">
+      <w:start w:val="1"/>
+      <w:numFmt w:val="bullet"/>
+      <w:lvlText w:val=""/>
+      <w:lvlJc w:val="left"/>
+      <w:pPr>
+        <w:ind w:left="720" w:hanging="360"/>
+      </w:pPr>
+      <w:rPr>
+        <w:rFonts w:ascii="Symbol" w:hAnsi="Symbol" w:hint="default"/>
+      </w:rPr>
+    </w:lvl>
+    <w:lvl w:ilvl="1" w:tplc="04090003" w:tentative="1">
+      <w:start w:val="1"/>
+      <w:numFmt w:val="bullet"/>
+      <w:lvlText w:val="o"/>
+      <w:lvlJc w:val="left"/>
+      <w:pPr>
+        <w:ind w:left="1440" w:hanging="360"/>
+      </w:pPr>
+      <w:rPr>
+        <w:rFonts w:ascii="Courier New" w:hAnsi="Courier New" w:cs="Courier New" w:hint="default"/>
+      </w:rPr>
+    </w:lvl>
+    <w:lvl w:ilvl="2" w:tplc="04090005" w:tentative="1">
+      <w:start w:val="1"/>
+      <w:numFmt w:val="bullet"/>
+      <w:lvlText w:val=""/>
+      <w:lvlJc w:val="left"/>
+      <w:pPr>
+        <w:ind w:left="2160" w:hanging="360"/>
+      </w:pPr>
+      <w:rPr>
+        <w:rFonts w:ascii="Wingdings" w:hAnsi="Wingdings" w:hint="default"/>
+      </w:rPr>
+    </w:lvl>
+    <w:lvl w:ilvl="3" w:tplc="04090001" w:tentative="1">
+      <w:start w:val="1"/>
+      <w:numFmt w:val="bullet"/>
+      <w:lvlText w:val=""/>
+      <w:lvlJc w:val="left"/>
+      <w:pPr>
+        <w:ind w:left="2880" w:hanging="360"/>
+      </w:pPr>
+      <w:rPr>
+        <w:rFonts w:ascii="Symbol" w:hAnsi="Symbol" w:hint="default"/>
+      </w:rPr>
+    </w:lvl>
+    <w:lvl w:ilvl="4" w:tplc="04090003" w:tentative="1">
+      <w:start w:val="1"/>
+      <w:numFmt w:val="bullet"/>
+      <w:lvlText w:val="o"/>
+      <w:lvlJc w:val="left"/>
+      <w:pPr>
+        <w:ind w:left="3600" w:hanging="360"/>
+      </w:pPr>
+      <w:rPr>
+        <w:rFonts w:ascii="Courier New" w:hAnsi="Courier New" w:cs="Courier New" w:hint="default"/>
+      </w:rPr>
+    </w:lvl>
+    <w:lvl w:ilvl="5" w:tplc="04090005" w:tentative="1">
+      <w:start w:val="1"/>
+      <w:numFmt w:val="bullet"/>
+      <w:lvlText w:val=""/>
+      <w:lvlJc w:val="left"/>
+      <w:pPr>
+        <w:ind w:left="4320" w:hanging="360"/>
+      </w:pPr>
+      <w:rPr>
+        <w:rFonts w:ascii="Wingdings" w:hAnsi="Wingdings" w:hint="default"/>
+      </w:rPr>
+    </w:lvl>
+    <w:lvl w:ilvl="6" w:tplc="04090001" w:tentative="1">
+      <w:start w:val="1"/>
+      <w:numFmt w:val="bullet"/>
+      <w:lvlText w:val=""/>
+      <w:lvlJc w:val="left"/>
+      <w:pPr>
+        <w:ind w:left="5040" w:hanging="360"/>
+      </w:pPr>
+      <w:rPr>
+        <w:rFonts w:ascii="Symbol" w:hAnsi="Symbol" w:hint="default"/>
+      </w:rPr>
+    </w:lvl>
+    <w:lvl w:ilvl="7" w:tplc="04090003" w:tentative="1">
+      <w:start w:val="1"/>
+      <w:numFmt w:val="bullet"/>
+      <w:lvlText w:val="o"/>
+      <w:lvlJc w:val="left"/>
+      <w:pPr>
+        <w:ind w:left="5760" w:hanging="360"/>
+      </w:pPr>
+      <w:rPr>
+        <w:rFonts w:ascii="Courier New" w:hAnsi="Courier New" w:cs="Courier New" w:hint="default"/>
+      </w:rPr>
+    </w:lvl>
+    <w:lvl w:ilvl="8" w:tplc="04090005" w:tentative="1">
+      <w:start w:val="1"/>
+      <w:numFmt w:val="bullet"/>
+      <w:lvlText w:val=""/>
+      <w:lvlJc w:val="left"/>
+      <w:pPr>
+        <w:ind w:left="6480" w:hanging="360"/>
+      </w:pPr>
+      <w:rPr>
+        <w:rFonts w:ascii="Wingdings" w:hAnsi="Wingdings" w:hint="default"/>
+      </w:rPr>
+    </w:lvl>
+  </w:abstractNum>
+  <w:abstractNum w:abstractNumId="2" w15:restartNumberingAfterBreak="0">
     <w:nsid w:val="61F42AB4"/>
     <w:multiLevelType w:val="hybridMultilevel"/>
     <w:tmpl w:val="F5B0F752"/>
@@ -814,7 +1037,7 @@
       </w:rPr>
     </w:lvl>
   </w:abstractNum>
-  <w:abstractNum w:abstractNumId="2" w15:restartNumberingAfterBreak="0">
+  <w:abstractNum w:abstractNumId="3" w15:restartNumberingAfterBreak="0">
     <w:nsid w:val="762955E8"/>
     <w:multiLevelType w:val="hybridMultilevel"/>
     <w:tmpl w:val="CBA4E424"/>
@@ -931,10 +1154,13 @@
     <w:abstractNumId w:val="0"/>
   </w:num>
   <w:num w:numId="2" w16cid:durableId="195512043">
-    <w:abstractNumId w:val="1"/>
+    <w:abstractNumId w:val="2"/>
   </w:num>
   <w:num w:numId="3" w16cid:durableId="1074208862">
-    <w:abstractNumId w:val="2"/>
+    <w:abstractNumId w:val="3"/>
+  </w:num>
+  <w:num w:numId="4" w16cid:durableId="103967275">
+    <w:abstractNumId w:val="1"/>
   </w:num>
 </w:numbering>
 </file>

</xml_diff>

<commit_message>
Lab 5 is now completed, built the foundataion for the API and noticed that i was tracking node_modules accidently so I removed them. report is still in progress.
</commit_message>
<xml_diff>
--- a/Report.docx
+++ b/Report.docx
@@ -271,7 +271,7 @@
               </mc:Choice>
               <mc:Fallback>
                 <w:pict>
-                  <v:group w14:anchorId="5168E7D2" id="Group 157" o:spid="_x0000_s1026" style="position:absolute;margin-left:0;margin-top:0;width:8in;height:95.7pt;z-index:251662336;mso-width-percent:941;mso-height-percent:121;mso-top-percent:23;mso-position-horizontal:center;mso-position-horizontal-relative:page;mso-position-vertical-relative:page;mso-width-percent:941;mso-height-percent:121;mso-top-percent:23" coordorigin="" coordsize="73152,12161" o:gfxdata="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">
+                  <v:group w14:anchorId="1750DF1A" id="Group 157" o:spid="_x0000_s1026" style="position:absolute;margin-left:0;margin-top:0;width:8in;height:95.7pt;z-index:251662336;mso-width-percent:941;mso-height-percent:121;mso-top-percent:23;mso-position-horizontal:center;mso-position-horizontal-relative:page;mso-position-vertical-relative:page;mso-width-percent:941;mso-height-percent:121;mso-top-percent:23" coordorigin="" coordsize="73152,12161" o:gfxdata="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">
                     <v:shape id="Rectangle 51" o:spid="_x0000_s1027" style="position:absolute;width:73152;height:11303;visibility:visible;mso-wrap-style:square;v-text-anchor:middle" coordsize="7312660,1129665" o:gfxdata="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" path="m,l7312660,r,1129665l3619500,733425,,1091565,,xe" fillcolor="#156082 [3204]" stroked="f" strokeweight="1pt">
                       <v:stroke joinstyle="miter"/>
                       <v:path arrowok="t" o:connecttype="custom" o:connectlocs="0,0;7315200,0;7315200,1130373;3620757,733885;0,1092249;0,0" o:connectangles="0,0,0,0,0,0"/>
@@ -609,7 +609,6 @@
                                   <w:t xml:space="preserve">The Link for the GitHub repo can be found here </w:t>
                                 </w:r>
                                 <w:hyperlink r:id="rId8" w:history="1">
-                                  <w:proofErr w:type="spellStart"/>
                                   <w:r>
                                     <w:rPr>
                                       <w:rStyle w:val="Hyperlink"/>
@@ -629,15 +628,7 @@
                                       <w:rStyle w:val="Hyperlink"/>
                                       <w:color w:val="ADADAD" w:themeColor="background2" w:themeShade="BF"/>
                                     </w:rPr>
-                                    <w:t>x</w:t>
-                                  </w:r>
-                                  <w:proofErr w:type="spellEnd"/>
-                                  <w:r>
-                                    <w:rPr>
-                                      <w:rStyle w:val="Hyperlink"/>
-                                      <w:color w:val="ADADAD" w:themeColor="background2" w:themeShade="BF"/>
-                                    </w:rPr>
-                                    <w:t>/skyboard</w:t>
+                                    <w:t>x/skyboard</w:t>
                                   </w:r>
                                 </w:hyperlink>
                               </w:p>
@@ -700,7 +691,6 @@
                             <w:t xml:space="preserve">The Link for the GitHub repo can be found here </w:t>
                           </w:r>
                           <w:hyperlink r:id="rId9" w:history="1">
-                            <w:proofErr w:type="spellStart"/>
                             <w:r>
                               <w:rPr>
                                 <w:rStyle w:val="Hyperlink"/>
@@ -720,15 +710,7 @@
                                 <w:rStyle w:val="Hyperlink"/>
                                 <w:color w:val="ADADAD" w:themeColor="background2" w:themeShade="BF"/>
                               </w:rPr>
-                              <w:t>x</w:t>
-                            </w:r>
-                            <w:proofErr w:type="spellEnd"/>
-                            <w:r>
-                              <w:rPr>
-                                <w:rStyle w:val="Hyperlink"/>
-                                <w:color w:val="ADADAD" w:themeColor="background2" w:themeShade="BF"/>
-                              </w:rPr>
-                              <w:t>/skyboard</w:t>
+                              <w:t>x/skyboard</w:t>
                             </w:r>
                           </w:hyperlink>
                         </w:p>
@@ -853,21 +835,12 @@
                                   <w:t xml:space="preserve"> </w:t>
                                 </w:r>
                                 <w:hyperlink r:id="rId10" w:history="1">
-                                  <w:proofErr w:type="spellStart"/>
                                   <w:r>
                                     <w:rPr>
                                       <w:rStyle w:val="Hyperlink"/>
                                       <w:color w:val="345964" w:themeColor="hyperlink" w:themeShade="BF"/>
                                     </w:rPr>
-                                    <w:t>SkyBoard</w:t>
-                                  </w:r>
-                                  <w:proofErr w:type="spellEnd"/>
-                                  <w:r>
-                                    <w:rPr>
-                                      <w:rStyle w:val="Hyperlink"/>
-                                      <w:color w:val="345964" w:themeColor="hyperlink" w:themeShade="BF"/>
-                                    </w:rPr>
-                                    <w:t xml:space="preserve"> - Live departures a</w:t>
+                                    <w:t>SkyBoard - Live departures a</w:t>
                                   </w:r>
                                   <w:r>
                                     <w:rPr>
@@ -980,21 +953,12 @@
                             <w:t xml:space="preserve"> </w:t>
                           </w:r>
                           <w:hyperlink r:id="rId11" w:history="1">
-                            <w:proofErr w:type="spellStart"/>
                             <w:r>
                               <w:rPr>
                                 <w:rStyle w:val="Hyperlink"/>
                                 <w:color w:val="345964" w:themeColor="hyperlink" w:themeShade="BF"/>
                               </w:rPr>
-                              <w:t>SkyBoard</w:t>
-                            </w:r>
-                            <w:proofErr w:type="spellEnd"/>
-                            <w:r>
-                              <w:rPr>
-                                <w:rStyle w:val="Hyperlink"/>
-                                <w:color w:val="345964" w:themeColor="hyperlink" w:themeShade="BF"/>
-                              </w:rPr>
-                              <w:t xml:space="preserve"> - Live departures a</w:t>
+                              <w:t>SkyBoard - Live departures a</w:t>
                             </w:r>
                             <w:r>
                               <w:rPr>
@@ -1350,7 +1314,6 @@
                                         <w:szCs w:val="36"/>
                                       </w:rPr>
                                     </w:pPr>
-                                    <w:proofErr w:type="spellStart"/>
                                     <w:r>
                                       <w:rPr>
                                         <w:color w:val="404040" w:themeColor="text1" w:themeTint="BF"/>
@@ -1359,7 +1322,6 @@
                                       </w:rPr>
                                       <w:t>SkyBoard</w:t>
                                     </w:r>
-                                    <w:proofErr w:type="spellEnd"/>
                                   </w:p>
                                 </w:sdtContent>
                               </w:sdt>
@@ -1453,7 +1415,6 @@
                                   <w:szCs w:val="36"/>
                                 </w:rPr>
                               </w:pPr>
-                              <w:proofErr w:type="spellStart"/>
                               <w:r>
                                 <w:rPr>
                                   <w:color w:val="404040" w:themeColor="text1" w:themeTint="BF"/>
@@ -1462,7 +1423,6 @@
                                 </w:rPr>
                                 <w:t>SkyBoard</w:t>
                               </w:r>
-                              <w:proofErr w:type="spellEnd"/>
                             </w:p>
                           </w:sdtContent>
                         </w:sdt>
@@ -2194,21 +2154,7 @@
         <w:rPr>
           <w:lang w:val="en-IE"/>
         </w:rPr>
-        <w:t>Created the Express app and re-constructed the MVC folders (</w:t>
-      </w:r>
-      <w:proofErr w:type="spellStart"/>
-      <w:r>
-        <w:rPr>
-          <w:lang w:val="en-IE"/>
-        </w:rPr>
-        <w:t>app_server</w:t>
-      </w:r>
-      <w:proofErr w:type="spellEnd"/>
-      <w:r>
-        <w:rPr>
-          <w:lang w:val="en-IE"/>
-        </w:rPr>
-        <w:t>/routes, controllers, views).</w:t>
+        <w:t>Created the Express app and re-constructed the MVC folders (app_server/routes, controllers, views).</w:t>
       </w:r>
     </w:p>
     <w:p>
@@ -2232,35 +2178,13 @@
         <w:rPr>
           <w:lang w:val="en-IE"/>
         </w:rPr>
-        <w:t>a .</w:t>
-      </w:r>
-      <w:proofErr w:type="spellStart"/>
-      <w:r>
-        <w:rPr>
-          <w:lang w:val="en-IE"/>
-        </w:rPr>
-        <w:t>gitignore</w:t>
-      </w:r>
-      <w:proofErr w:type="spellEnd"/>
-      <w:r>
-        <w:rPr>
-          <w:lang w:val="en-IE"/>
-        </w:rPr>
-        <w:t xml:space="preserve"> so </w:t>
-      </w:r>
-      <w:proofErr w:type="spellStart"/>
-      <w:r>
-        <w:rPr>
-          <w:lang w:val="en-IE"/>
-        </w:rPr>
-        <w:t>node_modules</w:t>
-      </w:r>
-      <w:proofErr w:type="spellEnd"/>
-      <w:r>
-        <w:rPr>
-          <w:lang w:val="en-IE"/>
-        </w:rPr>
-        <w:t xml:space="preserve"> isn’t committed, pushed</w:t>
+        <w:t>a .gitignore</w:t>
+      </w:r>
+      <w:r>
+        <w:rPr>
+          <w:lang w:val="en-IE"/>
+        </w:rPr>
+        <w:t xml:space="preserve"> so node_modules isn’t committed, pushed</w:t>
       </w:r>
       <w:r>
         <w:rPr>
@@ -2284,35 +2208,7 @@
         <w:rPr>
           <w:lang w:val="en-IE"/>
         </w:rPr>
-        <w:t xml:space="preserve">A problem I had was committing all the </w:t>
-      </w:r>
-      <w:proofErr w:type="spellStart"/>
-      <w:r>
-        <w:rPr>
-          <w:lang w:val="en-IE"/>
-        </w:rPr>
-        <w:t>node_modules</w:t>
-      </w:r>
-      <w:proofErr w:type="spellEnd"/>
-      <w:r>
-        <w:rPr>
-          <w:lang w:val="en-IE"/>
-        </w:rPr>
-        <w:t xml:space="preserve"> but I used a .</w:t>
-      </w:r>
-      <w:proofErr w:type="spellStart"/>
-      <w:r>
-        <w:rPr>
-          <w:lang w:val="en-IE"/>
-        </w:rPr>
-        <w:t>gitignore</w:t>
-      </w:r>
-      <w:proofErr w:type="spellEnd"/>
-      <w:r>
-        <w:rPr>
-          <w:lang w:val="en-IE"/>
-        </w:rPr>
-        <w:t xml:space="preserve"> and git rm -r –</w:t>
+        <w:t>A problem I had was committing all the node_modules but I used a .gitignore and git rm -r –</w:t>
       </w:r>
       <w:r>
         <w:rPr>
@@ -2324,21 +2220,7 @@
         <w:rPr>
           <w:lang w:val="en-IE"/>
         </w:rPr>
-        <w:t xml:space="preserve">cached </w:t>
-      </w:r>
-      <w:proofErr w:type="spellStart"/>
-      <w:r>
-        <w:rPr>
-          <w:lang w:val="en-IE"/>
-        </w:rPr>
-        <w:t>node_modules</w:t>
-      </w:r>
-      <w:proofErr w:type="spellEnd"/>
-      <w:r>
-        <w:rPr>
-          <w:lang w:val="en-IE"/>
-        </w:rPr>
-        <w:t xml:space="preserve"> to fix it.</w:t>
+        <w:t>cached node_modules to fix it.</w:t>
       </w:r>
     </w:p>
     <w:p>
@@ -2503,21 +2385,7 @@
         <w:rPr>
           <w:lang w:val="en-IE"/>
         </w:rPr>
-        <w:t xml:space="preserve">Followed the lab and got rid of all the hardcoded data out of the </w:t>
-      </w:r>
-      <w:proofErr w:type="spellStart"/>
-      <w:r>
-        <w:rPr>
-          <w:lang w:val="en-IE"/>
-        </w:rPr>
-        <w:t>dashboard.pug</w:t>
-      </w:r>
-      <w:proofErr w:type="spellEnd"/>
-      <w:r>
-        <w:rPr>
-          <w:lang w:val="en-IE"/>
-        </w:rPr>
-        <w:t xml:space="preserve"> view and into the dashboard function in the flights.js controller. Now the view only has variables in it.</w:t>
+        <w:t>Followed the lab and got rid of all the hardcoded data out of the dashboard.pug view and into the dashboard function in the flights.js controller. Now the view only has variables in it.</w:t>
       </w:r>
     </w:p>
     <w:p>
@@ -2535,21 +2403,7 @@
         <w:rPr>
           <w:lang w:val="en-IE"/>
         </w:rPr>
-        <w:t xml:space="preserve">Grouped the title, airport code and summary into a </w:t>
-      </w:r>
-      <w:proofErr w:type="spellStart"/>
-      <w:r>
-        <w:rPr>
-          <w:lang w:val="en-IE"/>
-        </w:rPr>
-        <w:t>pageHeader</w:t>
-      </w:r>
-      <w:proofErr w:type="spellEnd"/>
-      <w:r>
-        <w:rPr>
-          <w:lang w:val="en-IE"/>
-        </w:rPr>
-        <w:t xml:space="preserve"> object like loc8</w:t>
+        <w:t>Grouped the title, airport code and summary into a pageHeader object like loc8</w:t>
       </w:r>
       <w:r>
         <w:rPr>
@@ -2621,28 +2475,7 @@
         <w:rPr>
           <w:lang w:val="en-IE"/>
         </w:rPr>
-        <w:t xml:space="preserve">Added a </w:t>
-      </w:r>
-      <w:proofErr w:type="spellStart"/>
-      <w:r>
-        <w:rPr>
-          <w:lang w:val="en-IE"/>
-        </w:rPr>
-        <w:t>color</w:t>
-      </w:r>
-      <w:proofErr w:type="spellEnd"/>
-      <w:r>
-        <w:rPr>
-          <w:lang w:val="en-IE"/>
-        </w:rPr>
-        <w:t xml:space="preserve"> value to each flight so the status badge shows </w:t>
-      </w:r>
-      <w:proofErr w:type="spellStart"/>
-      <w:r>
-        <w:rPr>
-          <w:lang w:val="en-IE"/>
-        </w:rPr>
-        <w:t>Boots</w:t>
+        <w:t>Added a color value to each flight so the status badge shows Boots</w:t>
       </w:r>
       <w:r>
         <w:rPr>
@@ -2654,28 +2487,7 @@
         <w:rPr>
           <w:lang w:val="en-IE"/>
         </w:rPr>
-        <w:t>tap’s</w:t>
-      </w:r>
-      <w:proofErr w:type="spellEnd"/>
-      <w:r>
-        <w:rPr>
-          <w:lang w:val="en-IE"/>
-        </w:rPr>
-        <w:t xml:space="preserve"> success, warning or danger </w:t>
-      </w:r>
-      <w:proofErr w:type="spellStart"/>
-      <w:r>
-        <w:rPr>
-          <w:lang w:val="en-IE"/>
-        </w:rPr>
-        <w:t>colors</w:t>
-      </w:r>
-      <w:proofErr w:type="spellEnd"/>
-      <w:r>
-        <w:rPr>
-          <w:lang w:val="en-IE"/>
-        </w:rPr>
-        <w:t>.</w:t>
+        <w:t>tap’s success, warning or danger colors.</w:t>
       </w:r>
     </w:p>
     <w:p>
@@ -2693,49 +2505,7 @@
         <w:rPr>
           <w:lang w:val="en-IE"/>
         </w:rPr>
-        <w:t>Used the _includes/</w:t>
-      </w:r>
-      <w:proofErr w:type="spellStart"/>
-      <w:r>
-        <w:rPr>
-          <w:lang w:val="en-IE"/>
-        </w:rPr>
-        <w:t>sharedHTMLfunctions.pug</w:t>
-      </w:r>
-      <w:proofErr w:type="spellEnd"/>
-      <w:r>
-        <w:rPr>
-          <w:lang w:val="en-IE"/>
-        </w:rPr>
-        <w:t xml:space="preserve"> file for </w:t>
-      </w:r>
-      <w:proofErr w:type="spellStart"/>
-      <w:r>
-        <w:rPr>
-          <w:lang w:val="en-IE"/>
-        </w:rPr>
-        <w:t>mixins</w:t>
-      </w:r>
-      <w:proofErr w:type="spellEnd"/>
-      <w:r>
-        <w:rPr>
-          <w:lang w:val="en-IE"/>
-        </w:rPr>
-        <w:t xml:space="preserve">, similar to the labs start rating </w:t>
-      </w:r>
-      <w:proofErr w:type="spellStart"/>
-      <w:r>
-        <w:rPr>
-          <w:lang w:val="en-IE"/>
-        </w:rPr>
-        <w:t>mixin</w:t>
-      </w:r>
-      <w:proofErr w:type="spellEnd"/>
-      <w:r>
-        <w:rPr>
-          <w:lang w:val="en-IE"/>
-        </w:rPr>
-        <w:t>, so reusable pug code isn’t repeated on each page.</w:t>
+        <w:t>Used the _includes/sharedHTMLfunctions.pug file for mixins, similar to the labs start rating mixin, so reusable pug code isn’t repeated on each page.</w:t>
       </w:r>
     </w:p>
     <w:p>
@@ -2782,35 +2552,7 @@
         <w:rPr>
           <w:lang w:val="en-IE"/>
         </w:rPr>
-        <w:t xml:space="preserve">Installed mongoose and </w:t>
-      </w:r>
-      <w:proofErr w:type="spellStart"/>
-      <w:r>
-        <w:rPr>
-          <w:lang w:val="en-IE"/>
-        </w:rPr>
-        <w:t>mongodb</w:t>
-      </w:r>
-      <w:proofErr w:type="spellEnd"/>
-      <w:r>
-        <w:rPr>
-          <w:lang w:val="en-IE"/>
-        </w:rPr>
-        <w:t xml:space="preserve"> and created db.js in </w:t>
-      </w:r>
-      <w:proofErr w:type="spellStart"/>
-      <w:r>
-        <w:rPr>
-          <w:lang w:val="en-IE"/>
-        </w:rPr>
-        <w:t>app_server</w:t>
-      </w:r>
-      <w:proofErr w:type="spellEnd"/>
-      <w:r>
-        <w:rPr>
-          <w:lang w:val="en-IE"/>
-        </w:rPr>
-        <w:t>/model</w:t>
+        <w:t>Installed mongoose and mongodb and created db.js in app_server/model</w:t>
       </w:r>
       <w:r>
         <w:rPr>
@@ -2840,35 +2582,7 @@
         <w:rPr>
           <w:lang w:val="en-IE"/>
         </w:rPr>
-        <w:t>Set up a cluster on MongoDB Atlas (</w:t>
-      </w:r>
-      <w:proofErr w:type="spellStart"/>
-      <w:r>
-        <w:rPr>
-          <w:lang w:val="en-IE"/>
-        </w:rPr>
-        <w:t>SkyBoard</w:t>
-      </w:r>
-      <w:proofErr w:type="spellEnd"/>
-      <w:r>
-        <w:rPr>
-          <w:lang w:val="en-IE"/>
-        </w:rPr>
-        <w:t xml:space="preserve">-cluster) with a </w:t>
-      </w:r>
-      <w:proofErr w:type="spellStart"/>
-      <w:r>
-        <w:rPr>
-          <w:lang w:val="en-IE"/>
-        </w:rPr>
-        <w:t>SkyBoard</w:t>
-      </w:r>
-      <w:proofErr w:type="spellEnd"/>
-      <w:r>
-        <w:rPr>
-          <w:lang w:val="en-IE"/>
-        </w:rPr>
-        <w:t xml:space="preserve"> database and connected to it from db.js</w:t>
+        <w:t>Set up a cluster on MongoDB Atlas (SkyBoard-cluster) with a SkyBoard database and connected to it from db.js</w:t>
       </w:r>
     </w:p>
     <w:p>
@@ -2892,49 +2606,7 @@
         <w:rPr>
           <w:lang w:val="en-IE"/>
         </w:rPr>
-        <w:t xml:space="preserve">using </w:t>
-      </w:r>
-      <w:proofErr w:type="spellStart"/>
-      <w:r>
-        <w:rPr>
-          <w:lang w:val="en-IE"/>
-        </w:rPr>
-        <w:t>dotenv</w:t>
-      </w:r>
-      <w:proofErr w:type="spellEnd"/>
-      <w:r>
-        <w:rPr>
-          <w:lang w:val="en-IE"/>
-        </w:rPr>
-        <w:t xml:space="preserve">, and .env is in the </w:t>
-      </w:r>
-      <w:proofErr w:type="spellStart"/>
-      <w:r>
-        <w:rPr>
-          <w:lang w:val="en-IE"/>
-        </w:rPr>
-        <w:t>gitignore</w:t>
-      </w:r>
-      <w:proofErr w:type="spellEnd"/>
-      <w:r>
-        <w:rPr>
-          <w:lang w:val="en-IE"/>
-        </w:rPr>
-        <w:t xml:space="preserve"> so the password isn’t published to </w:t>
-      </w:r>
-      <w:proofErr w:type="spellStart"/>
-      <w:r>
-        <w:rPr>
-          <w:lang w:val="en-IE"/>
-        </w:rPr>
-        <w:t>github</w:t>
-      </w:r>
-      <w:proofErr w:type="spellEnd"/>
-      <w:r>
-        <w:rPr>
-          <w:lang w:val="en-IE"/>
-        </w:rPr>
-        <w:t>.</w:t>
+        <w:t>using dotenv, and .env is in the gitignore so the password isn’t published to github.</w:t>
       </w:r>
     </w:p>
     <w:p>
@@ -2952,21 +2624,7 @@
         <w:rPr>
           <w:lang w:val="en-IE"/>
         </w:rPr>
-        <w:t xml:space="preserve">Followed the lab but replaced Loc8r’s locations.js with </w:t>
-      </w:r>
-      <w:proofErr w:type="spellStart"/>
-      <w:r>
-        <w:rPr>
-          <w:lang w:val="en-IE"/>
-        </w:rPr>
-        <w:t>SkyBoard’s</w:t>
-      </w:r>
-      <w:proofErr w:type="spellEnd"/>
-      <w:r>
-        <w:rPr>
-          <w:lang w:val="en-IE"/>
-        </w:rPr>
-        <w:t xml:space="preserve"> flight</w:t>
+        <w:t>Followed the lab but replaced Loc8r’s locations.js with SkyBoard’s flight</w:t>
       </w:r>
       <w:r>
         <w:rPr>
@@ -2978,63 +2636,7 @@
         <w:rPr>
           <w:lang w:val="en-IE"/>
         </w:rPr>
-        <w:t xml:space="preserve">.js model. The </w:t>
-      </w:r>
-      <w:proofErr w:type="spellStart"/>
-      <w:r>
-        <w:rPr>
-          <w:lang w:val="en-IE"/>
-        </w:rPr>
-        <w:t>flightSchema</w:t>
-      </w:r>
-      <w:proofErr w:type="spellEnd"/>
-      <w:r>
-        <w:rPr>
-          <w:lang w:val="en-IE"/>
-        </w:rPr>
-        <w:t xml:space="preserve"> (flight, direction, place, time, gate, terminal, status, colour, starred) is nested inside the </w:t>
-      </w:r>
-      <w:proofErr w:type="spellStart"/>
-      <w:r>
-        <w:rPr>
-          <w:lang w:val="en-IE"/>
-        </w:rPr>
-        <w:t>airportSchema</w:t>
-      </w:r>
-      <w:proofErr w:type="spellEnd"/>
-      <w:r>
-        <w:rPr>
-          <w:lang w:val="en-IE"/>
-        </w:rPr>
-        <w:t xml:space="preserve"> the same way </w:t>
-      </w:r>
-      <w:proofErr w:type="spellStart"/>
-      <w:r>
-        <w:rPr>
-          <w:lang w:val="en-IE"/>
-        </w:rPr>
-        <w:t>openingTimeSchema</w:t>
-      </w:r>
-      <w:proofErr w:type="spellEnd"/>
-      <w:r>
-        <w:rPr>
-          <w:lang w:val="en-IE"/>
-        </w:rPr>
-        <w:t xml:space="preserve"> is nested inside </w:t>
-      </w:r>
-      <w:proofErr w:type="spellStart"/>
-      <w:r>
-        <w:rPr>
-          <w:lang w:val="en-IE"/>
-        </w:rPr>
-        <w:t>locationSchema</w:t>
-      </w:r>
-      <w:proofErr w:type="spellEnd"/>
-      <w:r>
-        <w:rPr>
-          <w:lang w:val="en-IE"/>
-        </w:rPr>
-        <w:t>.</w:t>
+        <w:t>.js model. The flightSchema (flight, direction, place, time, gate, terminal, status, colour, starred) is nested inside the airportSchema the same way openingTimeSchema is nested inside locationSchema.</w:t>
       </w:r>
     </w:p>
     <w:p>
@@ -3052,16 +2654,8 @@
         <w:rPr>
           <w:lang w:val="en-IE"/>
         </w:rPr>
-        <w:t xml:space="preserve">Used required: true on the main fields and default of false on starred, then built the Airport model with </w:t>
-      </w:r>
-      <w:proofErr w:type="spellStart"/>
-      <w:r>
-        <w:rPr>
-          <w:lang w:val="en-IE"/>
-        </w:rPr>
-        <w:t>mongoose.model</w:t>
-      </w:r>
-      <w:proofErr w:type="spellEnd"/>
+        <w:t>Used required: true on the main fields and default of false on starred, then built the Airport model with mongoose.model</w:t>
+      </w:r>
     </w:p>
     <w:p>
       <w:pPr>
@@ -3096,21 +2690,7 @@
         <w:rPr>
           <w:lang w:val="en-IE"/>
         </w:rPr>
-        <w:t xml:space="preserve">A problem I had was the connection string, it still had the &lt; &gt; around the password and the wrong options on the end which gave a </w:t>
-      </w:r>
-      <w:proofErr w:type="spellStart"/>
-      <w:r>
-        <w:rPr>
-          <w:lang w:val="en-IE"/>
-        </w:rPr>
-        <w:t>mongoError</w:t>
-      </w:r>
-      <w:proofErr w:type="spellEnd"/>
-      <w:r>
-        <w:rPr>
-          <w:lang w:val="en-IE"/>
-        </w:rPr>
-        <w:t>, but I fixed the string in the .env which fixed the issue.</w:t>
+        <w:t>A problem I had was the connection string, it still had the &lt; &gt; around the password and the wrong options on the end which gave a mongoError, but I fixed the string in the .env which fixed the issue.</w:t>
       </w:r>
     </w:p>
     <w:p>
@@ -3128,21 +2708,7 @@
         <w:rPr>
           <w:lang w:val="en-IE"/>
         </w:rPr>
-        <w:t>Another problem was not being able to connect on the college Wi-Fi. Test-</w:t>
-      </w:r>
-      <w:proofErr w:type="spellStart"/>
-      <w:r>
-        <w:rPr>
-          <w:lang w:val="en-IE"/>
-        </w:rPr>
-        <w:t>NetConnection</w:t>
-      </w:r>
-      <w:proofErr w:type="spellEnd"/>
-      <w:r>
-        <w:rPr>
-          <w:lang w:val="en-IE"/>
-        </w:rPr>
-        <w:t xml:space="preserve"> showed port 27017 was blocked, so I added 0.0.0.0/0 to the Atlas IP access list and it connected fine at home</w:t>
+        <w:t>Another problem was not being able to connect on the college Wi-Fi. Test-NetConnection showed port 27017 was blocked, so I added 0.0.0.0/0 to the Atlas IP access list and it connected fine at home</w:t>
       </w:r>
       <w:r>
         <w:rPr>
@@ -3274,6 +2840,46 @@
           <w:lang w:val="en-IE"/>
         </w:rPr>
       </w:pPr>
+      <w:r>
+        <w:rPr>
+          <w:lang w:val="en-IE"/>
+        </w:rPr>
+        <w:drawing>
+          <wp:inline distT="0" distB="0" distL="0" distR="0" wp14:anchorId="2DA5E5D3" wp14:editId="748642AA">
+            <wp:extent cx="5731510" cy="6255385"/>
+            <wp:effectExtent l="0" t="0" r="2540" b="0"/>
+            <wp:docPr id="942776674" name="Picture 1"/>
+            <wp:cNvGraphicFramePr>
+              <a:graphicFrameLocks xmlns:a="http://schemas.openxmlformats.org/drawingml/2006/main" noChangeAspect="1"/>
+            </wp:cNvGraphicFramePr>
+            <a:graphic xmlns:a="http://schemas.openxmlformats.org/drawingml/2006/main">
+              <a:graphicData uri="http://schemas.openxmlformats.org/drawingml/2006/picture">
+                <pic:pic xmlns:pic="http://schemas.openxmlformats.org/drawingml/2006/picture">
+                  <pic:nvPicPr>
+                    <pic:cNvPr id="942776674" name=""/>
+                    <pic:cNvPicPr/>
+                  </pic:nvPicPr>
+                  <pic:blipFill>
+                    <a:blip r:embed="rId13"/>
+                    <a:stretch>
+                      <a:fillRect/>
+                    </a:stretch>
+                  </pic:blipFill>
+                  <pic:spPr>
+                    <a:xfrm>
+                      <a:off x="0" y="0"/>
+                      <a:ext cx="5731510" cy="6255385"/>
+                    </a:xfrm>
+                    <a:prstGeom prst="rect">
+                      <a:avLst/>
+                    </a:prstGeom>
+                  </pic:spPr>
+                </pic:pic>
+              </a:graphicData>
+            </a:graphic>
+          </wp:inline>
+        </w:drawing>
+      </w:r>
     </w:p>
     <w:p>
       <w:pPr>
@@ -3375,7 +2981,6 @@
         <w:rPr>
           <w:lang w:val="en-IE"/>
         </w:rPr>
-        <w:lastRenderedPageBreak/>
         <w:t>References and sources I used</w:t>
       </w:r>
       <w:bookmarkEnd w:id="2"/>
@@ -3409,7 +3014,7 @@
           <w:lang w:val="en-IE"/>
         </w:rPr>
       </w:pPr>
-      <w:hyperlink r:id="rId13" w:anchor="/media-object/4074162&amp;sourcetype=Audio%20&amp;%20Video%20Works" w:history="1">
+      <w:hyperlink r:id="rId14" w:anchor="/media-object/4074162&amp;sourcetype=Audio%20&amp;%20Video%20Works" w:history="1">
         <w:r>
           <w:rPr>
             <w:rStyle w:val="Hyperlink"/>
@@ -3429,7 +3034,7 @@
           <w:lang w:val="en-IE"/>
         </w:rPr>
       </w:pPr>
-      <w:hyperlink r:id="rId14" w:history="1">
+      <w:hyperlink r:id="rId15" w:history="1">
         <w:r>
           <w:rPr>
             <w:rStyle w:val="Hyperlink"/>
@@ -3449,7 +3054,7 @@
           <w:lang w:val="en-IE"/>
         </w:rPr>
       </w:pPr>
-      <w:hyperlink r:id="rId15" w:history="1">
+      <w:hyperlink r:id="rId16" w:history="1">
         <w:r>
           <w:rPr>
             <w:rStyle w:val="Hyperlink"/>
@@ -3469,7 +3074,7 @@
           <w:lang w:val="en-IE"/>
         </w:rPr>
       </w:pPr>
-      <w:hyperlink r:id="rId16" w:history="1">
+      <w:hyperlink r:id="rId17" w:history="1">
         <w:r>
           <w:rPr>
             <w:rStyle w:val="Hyperlink"/>
@@ -3489,7 +3094,7 @@
           <w:lang w:val="en-IE"/>
         </w:rPr>
       </w:pPr>
-      <w:hyperlink r:id="rId17" w:history="1">
+      <w:hyperlink r:id="rId18" w:history="1">
         <w:r>
           <w:rPr>
             <w:rStyle w:val="Hyperlink"/>
@@ -3509,7 +3114,7 @@
           <w:lang w:val="en-IE"/>
         </w:rPr>
       </w:pPr>
-      <w:hyperlink r:id="rId18" w:history="1">
+      <w:hyperlink r:id="rId19" w:history="1">
         <w:r>
           <w:rPr>
             <w:rStyle w:val="Hyperlink"/>
@@ -3529,7 +3134,7 @@
           <w:lang w:val="en-IE"/>
         </w:rPr>
       </w:pPr>
-      <w:hyperlink r:id="rId19" w:history="1">
+      <w:hyperlink r:id="rId20" w:history="1">
         <w:r>
           <w:rPr>
             <w:rStyle w:val="Hyperlink"/>
@@ -3549,7 +3154,7 @@
           <w:lang w:val="en-IE"/>
         </w:rPr>
       </w:pPr>
-      <w:hyperlink r:id="rId20" w:history="1">
+      <w:hyperlink r:id="rId21" w:history="1">
         <w:r>
           <w:rPr>
             <w:rStyle w:val="Hyperlink"/>
@@ -3569,7 +3174,7 @@
           <w:lang w:val="en-IE"/>
         </w:rPr>
       </w:pPr>
-      <w:hyperlink r:id="rId21" w:history="1">
+      <w:hyperlink r:id="rId22" w:history="1">
         <w:r>
           <w:rPr>
             <w:rStyle w:val="Hyperlink"/>
@@ -3589,7 +3194,7 @@
           <w:lang w:val="en-IE"/>
         </w:rPr>
       </w:pPr>
-      <w:hyperlink r:id="rId22" w:history="1">
+      <w:hyperlink r:id="rId23" w:history="1">
         <w:r>
           <w:rPr>
             <w:rStyle w:val="Hyperlink"/>
@@ -3609,7 +3214,7 @@
           <w:lang w:val="en-IE"/>
         </w:rPr>
       </w:pPr>
-      <w:hyperlink r:id="rId23" w:history="1">
+      <w:hyperlink r:id="rId24" w:history="1">
         <w:r>
           <w:rPr>
             <w:rStyle w:val="Hyperlink"/>
@@ -3629,20 +3234,12 @@
           <w:lang w:val="en-IE"/>
         </w:rPr>
       </w:pPr>
-      <w:hyperlink r:id="rId24" w:history="1">
-        <w:proofErr w:type="spellStart"/>
+      <w:hyperlink r:id="rId25" w:history="1">
         <w:r>
           <w:rPr>
             <w:rStyle w:val="Hyperlink"/>
           </w:rPr>
-          <w:t>PugHTML</w:t>
-        </w:r>
-        <w:proofErr w:type="spellEnd"/>
-        <w:r>
-          <w:rPr>
-            <w:rStyle w:val="Hyperlink"/>
-          </w:rPr>
-          <w:t xml:space="preserve"> - HTML to Pug/Jade Converter with Bootstrap &amp; Tailwind CSS</w:t>
+          <w:t>PugHTML - HTML to Pug/Jade Converter with Bootstrap &amp; Tailwind CSS</w:t>
         </w:r>
       </w:hyperlink>
     </w:p>
@@ -3676,7 +3273,7 @@
         </w:rPr>
         <w:t xml:space="preserve"> </w:t>
       </w:r>
-      <w:hyperlink r:id="rId25" w:history="1">
+      <w:hyperlink r:id="rId26" w:history="1">
         <w:r>
           <w:rPr>
             <w:rStyle w:val="Hyperlink"/>

</xml_diff>